<commit_message>
adding more exer+sol module05
</commit_message>
<xml_diff>
--- a/subjects/subject_words/java05_es_subject.docx
+++ b/subjects/subject_words/java05_es_subject.docx
@@ -430,7 +430,7 @@
           </mc:Choice>
           <mc:Fallback>
             <w:pict>
-              <v:shape w14:anchorId="023A8389" id="Graphic 3" o:spid="_x0000_s1026" style="position:absolute;margin-left:86.45pt;margin-top:20.05pt;width:476.5pt;height:25.2pt;z-index:-251656704;visibility:visible;mso-wrap-style:square;mso-wrap-distance-left:0;mso-wrap-distance-top:0;mso-wrap-distance-right:0;mso-wrap-distance-bottom:0;mso-position-horizontal:absolute;mso-position-horizontal-relative:page;mso-position-vertical:absolute;mso-position-vertical-relative:text;v-text-anchor:top" coordsize="6051550,320040" o:gfxdata="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" path="m6051397,l5594197,,,12,,18605r5594197,l5594197,320040r457200,l6051397,xe" fillcolor="black" stroked="f">
+              <v:shape w14:anchorId="57F19F69" id="Graphic 3" o:spid="_x0000_s1026" style="position:absolute;margin-left:86.45pt;margin-top:20.05pt;width:476.5pt;height:25.2pt;z-index:-251656704;visibility:visible;mso-wrap-style:square;mso-wrap-distance-left:0;mso-wrap-distance-top:0;mso-wrap-distance-right:0;mso-wrap-distance-bottom:0;mso-position-horizontal:absolute;mso-position-horizontal-relative:page;mso-position-vertical:absolute;mso-position-vertical-relative:text;v-text-anchor:top" coordsize="6051550,320040" o:gfxdata="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" path="m6051397,l5594197,,,12,,18605r5594197,l5594197,320040r457200,l6051397,xe" fillcolor="black" stroked="f">
                 <v:path arrowok="t"/>
                 <w10:wrap type="topAndBottom" anchorx="page"/>
               </v:shape>
@@ -456,7 +456,7 @@
         </w:sectPr>
       </w:pPr>
     </w:p>
-    <w:bookmarkStart w:id="0" w:name="_Toc235822283" w:displacedByCustomXml="next"/>
+    <w:bookmarkStart w:id="0" w:name="_Toc235954437" w:displacedByCustomXml="next"/>
     <w:sdt>
       <w:sdtPr>
         <w:rPr>
@@ -515,7 +515,7 @@
           <w:r>
             <w:fldChar w:fldCharType="separate"/>
           </w:r>
-          <w:hyperlink w:anchor="_Toc235822283" w:history="1">
+          <w:hyperlink w:anchor="_Toc235954437" w:history="1">
             <w:r>
               <w:rPr>
                 <w:rStyle w:val="Hipervnculo"/>
@@ -542,7 +542,7 @@
                 <w:noProof/>
                 <w:webHidden/>
               </w:rPr>
-              <w:instrText xml:space="preserve"> PAGEREF _Toc235822283 \h </w:instrText>
+              <w:instrText xml:space="preserve"> PAGEREF _Toc235954437 \h </w:instrText>
             </w:r>
             <w:r>
               <w:rPr>
@@ -588,7 +588,7 @@
               <w14:ligatures w14:val="standardContextual"/>
             </w:rPr>
           </w:pPr>
-          <w:hyperlink w:anchor="_Toc235822284" w:history="1">
+          <w:hyperlink w:anchor="_Toc235954438" w:history="1">
             <w:r>
               <w:rPr>
                 <w:rStyle w:val="Hipervnculo"/>
@@ -632,7 +632,7 @@
                 <w:noProof/>
                 <w:webHidden/>
               </w:rPr>
-              <w:instrText xml:space="preserve"> PAGEREF _Toc235822284 \h </w:instrText>
+              <w:instrText xml:space="preserve"> PAGEREF _Toc235954438 \h </w:instrText>
             </w:r>
             <w:r>
               <w:rPr>
@@ -678,7 +678,7 @@
               <w14:ligatures w14:val="standardContextual"/>
             </w:rPr>
           </w:pPr>
-          <w:hyperlink w:anchor="_Toc235822285" w:history="1">
+          <w:hyperlink w:anchor="_Toc235954439" w:history="1">
             <w:r>
               <w:rPr>
                 <w:rStyle w:val="Hipervnculo"/>
@@ -722,7 +722,7 @@
                 <w:noProof/>
                 <w:webHidden/>
               </w:rPr>
-              <w:instrText xml:space="preserve"> PAGEREF _Toc235822285 \h </w:instrText>
+              <w:instrText xml:space="preserve"> PAGEREF _Toc235954439 \h </w:instrText>
             </w:r>
             <w:r>
               <w:rPr>
@@ -768,7 +768,7 @@
               <w14:ligatures w14:val="standardContextual"/>
             </w:rPr>
           </w:pPr>
-          <w:hyperlink w:anchor="_Toc235822286" w:history="1">
+          <w:hyperlink w:anchor="_Toc235954440" w:history="1">
             <w:r>
               <w:rPr>
                 <w:rStyle w:val="Hipervnculo"/>
@@ -812,7 +812,7 @@
                 <w:noProof/>
                 <w:webHidden/>
               </w:rPr>
-              <w:instrText xml:space="preserve"> PAGEREF _Toc235822286 \h </w:instrText>
+              <w:instrText xml:space="preserve"> PAGEREF _Toc235954440 \h </w:instrText>
             </w:r>
             <w:r>
               <w:rPr>
@@ -858,7 +858,7 @@
               <w14:ligatures w14:val="standardContextual"/>
             </w:rPr>
           </w:pPr>
-          <w:hyperlink w:anchor="_Toc235822287" w:history="1">
+          <w:hyperlink w:anchor="_Toc235954441" w:history="1">
             <w:r>
               <w:rPr>
                 <w:rStyle w:val="Hipervnculo"/>
@@ -916,15 +916,7 @@
                 <w:noProof/>
                 <w:w w:val="90"/>
               </w:rPr>
-              <w:t>L</w:t>
-            </w:r>
-            <w:r>
-              <w:rPr>
-                <w:rStyle w:val="Hipervnculo"/>
-                <w:noProof/>
-                <w:w w:val="90"/>
-              </w:rPr>
-              <w:t>a Cámara de Contención</w:t>
+              <w:t>La Cámara de Contención</w:t>
             </w:r>
             <w:r>
               <w:rPr>
@@ -945,7 +937,7 @@
                 <w:noProof/>
                 <w:webHidden/>
               </w:rPr>
-              <w:instrText xml:space="preserve"> PAGEREF _Toc235822287 \h </w:instrText>
+              <w:instrText xml:space="preserve"> PAGEREF _Toc235954441 \h </w:instrText>
             </w:r>
             <w:r>
               <w:rPr>
@@ -991,7 +983,7 @@
               <w14:ligatures w14:val="standardContextual"/>
             </w:rPr>
           </w:pPr>
-          <w:hyperlink w:anchor="_Toc235822288" w:history="1">
+          <w:hyperlink w:anchor="_Toc235954442" w:history="1">
             <w:r>
               <w:rPr>
                 <w:rStyle w:val="Hipervnculo"/>
@@ -1041,7 +1033,25 @@
                 <w:spacing w:val="-15"/>
                 <w:w w:val="90"/>
               </w:rPr>
-              <w:t xml:space="preserve"> Cuando Todo Sale Verde</w:t>
+              <w:t xml:space="preserve"> </w:t>
+            </w:r>
+            <w:r>
+              <w:rPr>
+                <w:rStyle w:val="Hipervnculo"/>
+                <w:noProof/>
+                <w:spacing w:val="-15"/>
+                <w:w w:val="90"/>
+              </w:rPr>
+              <w:t>C</w:t>
+            </w:r>
+            <w:r>
+              <w:rPr>
+                <w:rStyle w:val="Hipervnculo"/>
+                <w:noProof/>
+                <w:spacing w:val="-15"/>
+                <w:w w:val="90"/>
+              </w:rPr>
+              <w:t>uando Todo Sale Verde</w:t>
             </w:r>
             <w:r>
               <w:rPr>
@@ -1062,7 +1072,7 @@
                 <w:noProof/>
                 <w:webHidden/>
               </w:rPr>
-              <w:instrText xml:space="preserve"> PAGEREF _Toc235822288 \h </w:instrText>
+              <w:instrText xml:space="preserve"> PAGEREF _Toc235954442 \h </w:instrText>
             </w:r>
             <w:r>
               <w:rPr>
@@ -1108,7 +1118,7 @@
               <w14:ligatures w14:val="standardContextual"/>
             </w:rPr>
           </w:pPr>
-          <w:hyperlink w:anchor="_Toc235822289" w:history="1">
+          <w:hyperlink w:anchor="_Toc235954443" w:history="1">
             <w:r>
               <w:rPr>
                 <w:rStyle w:val="Hipervnculo"/>
@@ -1179,7 +1189,7 @@
                 <w:noProof/>
                 <w:webHidden/>
               </w:rPr>
-              <w:instrText xml:space="preserve"> PAGEREF _Toc235822289 \h </w:instrText>
+              <w:instrText xml:space="preserve"> PAGEREF _Toc235954443 \h </w:instrText>
             </w:r>
             <w:r>
               <w:rPr>
@@ -1225,7 +1235,7 @@
               <w14:ligatures w14:val="standardContextual"/>
             </w:rPr>
           </w:pPr>
-          <w:hyperlink w:anchor="_Toc235822290" w:history="1">
+          <w:hyperlink w:anchor="_Toc235954444" w:history="1">
             <w:r>
               <w:rPr>
                 <w:rStyle w:val="Hipervnculo"/>
@@ -1304,7 +1314,7 @@
                 <w:noProof/>
                 <w:webHidden/>
               </w:rPr>
-              <w:instrText xml:space="preserve"> PAGEREF _Toc235822290 \h </w:instrText>
+              <w:instrText xml:space="preserve"> PAGEREF _Toc235954444 \h </w:instrText>
             </w:r>
             <w:r>
               <w:rPr>
@@ -1350,7 +1360,7 @@
               <w14:ligatures w14:val="standardContextual"/>
             </w:rPr>
           </w:pPr>
-          <w:hyperlink w:anchor="_Toc235822291" w:history="1">
+          <w:hyperlink w:anchor="_Toc235954445" w:history="1">
             <w:r>
               <w:rPr>
                 <w:rStyle w:val="Hipervnculo"/>
@@ -1421,7 +1431,7 @@
                 <w:noProof/>
                 <w:webHidden/>
               </w:rPr>
-              <w:instrText xml:space="preserve"> PAGEREF _Toc235822291 \h </w:instrText>
+              <w:instrText xml:space="preserve"> PAGEREF _Toc235954445 \h </w:instrText>
             </w:r>
             <w:r>
               <w:rPr>
@@ -1467,7 +1477,7 @@
               <w14:ligatures w14:val="standardContextual"/>
             </w:rPr>
           </w:pPr>
-          <w:hyperlink w:anchor="_Toc235822292" w:history="1">
+          <w:hyperlink w:anchor="_Toc235954446" w:history="1">
             <w:r>
               <w:rPr>
                 <w:rStyle w:val="Hipervnculo"/>
@@ -1546,7 +1556,7 @@
                 <w:noProof/>
                 <w:webHidden/>
               </w:rPr>
-              <w:instrText xml:space="preserve"> PAGEREF _Toc235822292 \h </w:instrText>
+              <w:instrText xml:space="preserve"> PAGEREF _Toc235954446 \h </w:instrText>
             </w:r>
             <w:r>
               <w:rPr>
@@ -1591,7 +1601,7 @@
               <w14:ligatures w14:val="standardContextual"/>
             </w:rPr>
           </w:pPr>
-          <w:hyperlink w:anchor="_Toc235822293" w:history="1">
+          <w:hyperlink w:anchor="_Toc235954447" w:history="1">
             <w:r>
               <w:rPr>
                 <w:rStyle w:val="Hipervnculo"/>
@@ -1618,7 +1628,7 @@
                 <w:noProof/>
                 <w:webHidden/>
               </w:rPr>
-              <w:instrText xml:space="preserve"> PAGEREF _Toc235822293 \h </w:instrText>
+              <w:instrText xml:space="preserve"> PAGEREF _Toc235954447 \h </w:instrText>
             </w:r>
             <w:r>
               <w:rPr>
@@ -1663,7 +1673,7 @@
               <w14:ligatures w14:val="standardContextual"/>
             </w:rPr>
           </w:pPr>
-          <w:hyperlink w:anchor="_Toc235822294" w:history="1">
+          <w:hyperlink w:anchor="_Toc235954448" w:history="1">
             <w:r>
               <w:rPr>
                 <w:rStyle w:val="Hipervnculo"/>
@@ -1690,7 +1700,7 @@
                 <w:noProof/>
                 <w:webHidden/>
               </w:rPr>
-              <w:instrText xml:space="preserve"> PAGEREF _Toc235822294 \h </w:instrText>
+              <w:instrText xml:space="preserve"> PAGEREF _Toc235954448 \h </w:instrText>
             </w:r>
             <w:r>
               <w:rPr>
@@ -1752,7 +1762,7 @@
           <w:numId w:val="5"/>
         </w:numPr>
       </w:pPr>
-      <w:bookmarkStart w:id="1" w:name="_Toc235822284"/>
+      <w:bookmarkStart w:id="1" w:name="_Toc235954438"/>
       <w:r>
         <w:lastRenderedPageBreak/>
         <w:t xml:space="preserve">Gamma </w:t>
@@ -2591,19 +2601,11 @@
         </w:rPr>
         <w:t xml:space="preserve"> </w:t>
       </w:r>
-      <w:proofErr w:type="spellStart"/>
       <w:r>
         <w:rPr>
           <w:spacing w:val="-6"/>
         </w:rPr>
-        <w:t>Code</w:t>
-      </w:r>
-      <w:proofErr w:type="spellEnd"/>
-      <w:r>
-        <w:rPr>
-          <w:spacing w:val="-6"/>
-        </w:rPr>
-        <w:t>,</w:t>
+        <w:t>Code,</w:t>
       </w:r>
       <w:r>
         <w:rPr>
@@ -2867,7 +2869,7 @@
         </w:numPr>
       </w:pPr>
       <w:bookmarkStart w:id="2" w:name="_bookmark1"/>
-      <w:bookmarkStart w:id="3" w:name="_Toc235822285"/>
+      <w:bookmarkStart w:id="3" w:name="_Toc235954439"/>
       <w:bookmarkEnd w:id="2"/>
       <w:r>
         <w:t>Prólogo</w:t>
@@ -3263,7 +3265,7 @@
         </w:numPr>
       </w:pPr>
       <w:bookmarkStart w:id="4" w:name="_bookmark2"/>
-      <w:bookmarkStart w:id="5" w:name="_Toc235822286"/>
+      <w:bookmarkStart w:id="5" w:name="_Toc235954440"/>
       <w:bookmarkEnd w:id="4"/>
       <w:r>
         <w:lastRenderedPageBreak/>
@@ -4255,7 +4257,7 @@
           </mc:Choice>
           <mc:Fallback>
             <w:pict>
-              <v:group w14:anchorId="77D5869E" id="Group 15" o:spid="_x0000_s1026" style="width:442.05pt;height:1.6pt;mso-position-horizontal-relative:char;mso-position-vertical-relative:line" coordsize="56140,203" o:gfxdata="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">
+              <v:group w14:anchorId="7EA10BA8" id="Group 15" o:spid="_x0000_s1026" style="width:442.05pt;height:1.6pt;mso-position-horizontal-relative:char;mso-position-vertical-relative:line" coordsize="56140,203" o:gfxdata="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">
                 <v:shape id="Graphic 16" o:spid="_x0000_s1027" style="position:absolute;width:56127;height:196;visibility:visible;mso-wrap-style:square;v-text-anchor:top" coordsize="5612765,19685" o:gfxdata="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" path="m5612765,l,,,19685r5612765,l5612765,xe" fillcolor="#9f9f9f" stroked="f">
                   <v:path arrowok="t"/>
                 </v:shape>
@@ -4300,7 +4302,7 @@
         </w:numPr>
         <w:jc w:val="left"/>
       </w:pPr>
-      <w:bookmarkStart w:id="7" w:name="_Toc235822287"/>
+      <w:bookmarkStart w:id="7" w:name="_Toc235954441"/>
       <w:r>
         <w:rPr>
           <w:w w:val="90"/>
@@ -4403,6 +4405,12 @@
         </w:rPr>
         <w:t>ContainmentChamber.java</w:t>
       </w:r>
+      <w:r>
+        <w:rPr>
+          <w:w w:val="90"/>
+        </w:rPr>
+        <w:t>, Demo.java</w:t>
+      </w:r>
     </w:p>
     <w:p>
       <w:pPr>
@@ -4416,6 +4424,9 @@
         </w:tabs>
         <w:spacing w:line="252" w:lineRule="auto"/>
         <w:ind w:right="1037"/>
+        <w:rPr>
+          <w:w w:val="90"/>
+        </w:rPr>
       </w:pPr>
       <w:r>
         <w:rPr>
@@ -4460,6 +4471,18 @@
         <w:t>System.out.println</w:t>
       </w:r>
       <w:proofErr w:type="spellEnd"/>
+      <w:r>
+        <w:rPr>
+          <w:w w:val="90"/>
+        </w:rPr>
+        <w:t xml:space="preserve">, </w:t>
+      </w:r>
+      <w:r>
+        <w:rPr>
+          <w:w w:val="90"/>
+        </w:rPr>
+        <w:t>@Override</w:t>
+      </w:r>
     </w:p>
     <w:p>
       <w:pPr>
@@ -4507,46 +4530,7 @@
           <w:w w:val="90"/>
           <w:lang w:val="en-US"/>
         </w:rPr>
-        <w:t xml:space="preserve">public static void </w:t>
-      </w:r>
-      <w:proofErr w:type="gramStart"/>
-      <w:r>
-        <w:rPr>
-          <w:w w:val="90"/>
-          <w:lang w:val="en-US"/>
-        </w:rPr>
-        <w:t>main(</w:t>
-      </w:r>
-      <w:proofErr w:type="gramEnd"/>
-      <w:r>
-        <w:rPr>
-          <w:w w:val="90"/>
-          <w:lang w:val="en-US"/>
-        </w:rPr>
-        <w:t xml:space="preserve">String[] </w:t>
-      </w:r>
-      <w:proofErr w:type="spellStart"/>
-      <w:r>
-        <w:rPr>
-          <w:w w:val="90"/>
-          <w:lang w:val="en-US"/>
-        </w:rPr>
-        <w:t>args</w:t>
-      </w:r>
-      <w:proofErr w:type="spellEnd"/>
-      <w:r>
-        <w:rPr>
-          <w:w w:val="90"/>
-          <w:lang w:val="en-US"/>
-        </w:rPr>
-        <w:t>)</w:t>
-      </w:r>
-      <w:r>
-        <w:rPr>
-          <w:w w:val="90"/>
-          <w:lang w:val="en-US"/>
-        </w:rPr>
-        <w:t>.</w:t>
+        <w:t>Any.</w:t>
       </w:r>
     </w:p>
     <w:p>
@@ -4735,25 +4719,29 @@
         <w:rPr>
           <w:spacing w:val="-8"/>
         </w:rPr>
-        <w:t xml:space="preserve"> de Java.</w:t>
-      </w:r>
-    </w:p>
-    <w:p>
-      <w:pPr>
-        <w:ind w:left="622"/>
+        <w:t xml:space="preserve"> de </w:t>
+      </w:r>
+      <w:proofErr w:type="spellStart"/>
+      <w:r>
         <w:rPr>
           <w:spacing w:val="-8"/>
         </w:rPr>
-      </w:pPr>
+        <w:t>Java.Tu</w:t>
+      </w:r>
+      <w:proofErr w:type="spellEnd"/>
       <w:r>
         <w:rPr>
           <w:spacing w:val="-8"/>
         </w:rPr>
-        <w:t xml:space="preserve">Tu misión es construir una clase llamada </w:t>
+        <w:t xml:space="preserve"> misión es construir una clase llamada </w:t>
       </w:r>
       <w:proofErr w:type="spellStart"/>
       <w:r>
         <w:rPr>
+          <w:b/>
+          <w:bCs/>
+          <w:i/>
+          <w:iCs/>
           <w:spacing w:val="-8"/>
         </w:rPr>
         <w:t>ContainmentChamber</w:t>
@@ -4830,42 +4818,111 @@
         </w:numPr>
         <w:rPr>
           <w:spacing w:val="-8"/>
-          <w:lang w:val="en-US"/>
-        </w:rPr>
-      </w:pPr>
+        </w:rPr>
+      </w:pPr>
+      <w:r>
+        <w:rPr>
+          <w:spacing w:val="-8"/>
+        </w:rPr>
+        <w:t xml:space="preserve">Implementar la interfaz </w:t>
+      </w:r>
       <w:proofErr w:type="spellStart"/>
       <w:r>
+        <w:rPr>
+          <w:b/>
+          <w:bCs/>
+          <w:i/>
+          <w:iCs/>
+          <w:spacing w:val="-8"/>
+        </w:rPr>
+        <w:t>AutoCloseable</w:t>
+      </w:r>
+      <w:proofErr w:type="spellEnd"/>
+      <w:r>
+        <w:rPr>
+          <w:b/>
+          <w:bCs/>
+          <w:i/>
+          <w:iCs/>
+          <w:spacing w:val="-8"/>
+        </w:rPr>
+        <w:t xml:space="preserve"> con </w:t>
+      </w:r>
+      <w:r>
+        <w:rPr>
+          <w:b/>
+          <w:bCs/>
+          <w:i/>
+          <w:iCs/>
+          <w:w w:val="90"/>
+        </w:rPr>
+        <w:t>ContainmentChamber</w:t>
+      </w:r>
+      <w:r>
+        <w:rPr>
+          <w:b/>
+          <w:bCs/>
+          <w:i/>
+          <w:iCs/>
+          <w:w w:val="90"/>
+        </w:rPr>
+        <w:t>.java</w:t>
+      </w:r>
+      <w:r>
+        <w:rPr>
+          <w:b/>
+          <w:bCs/>
+          <w:i/>
+          <w:iCs/>
+          <w:spacing w:val="-8"/>
+        </w:rPr>
+        <w:t>.</w:t>
+      </w:r>
+    </w:p>
+    <w:p>
+      <w:pPr>
+        <w:numPr>
+          <w:ilvl w:val="0"/>
+          <w:numId w:val="10"/>
+        </w:numPr>
         <w:rPr>
           <w:spacing w:val="-8"/>
           <w:lang w:val="en-US"/>
         </w:rPr>
-        <w:t>Implementar</w:t>
-      </w:r>
-      <w:proofErr w:type="spellEnd"/>
+      </w:pPr>
+      <w:proofErr w:type="spellStart"/>
       <w:r>
         <w:rPr>
           <w:spacing w:val="-8"/>
           <w:lang w:val="en-US"/>
         </w:rPr>
-        <w:t xml:space="preserve"> la </w:t>
-      </w:r>
-      <w:proofErr w:type="spellStart"/>
+        <w:t>Definir</w:t>
+      </w:r>
+      <w:proofErr w:type="spellEnd"/>
       <w:r>
         <w:rPr>
           <w:spacing w:val="-8"/>
           <w:lang w:val="en-US"/>
         </w:rPr>
-        <w:t>interfaz</w:t>
-      </w:r>
-      <w:proofErr w:type="spellEnd"/>
+        <w:t xml:space="preserve"> el </w:t>
+      </w:r>
+      <w:proofErr w:type="spellStart"/>
       <w:r>
         <w:rPr>
           <w:spacing w:val="-8"/>
           <w:lang w:val="en-US"/>
         </w:rPr>
+        <w:t>método</w:t>
+      </w:r>
+      <w:proofErr w:type="spellEnd"/>
+      <w:r>
+        <w:rPr>
+          <w:spacing w:val="-8"/>
+          <w:lang w:val="en-US"/>
+        </w:rPr>
         <w:t xml:space="preserve"> </w:t>
       </w:r>
-      <w:proofErr w:type="spellStart"/>
+      <w:proofErr w:type="gramStart"/>
       <w:r>
         <w:rPr>
           <w:b/>
@@ -4875,77 +4932,9 @@
           <w:spacing w:val="-8"/>
           <w:lang w:val="en-US"/>
         </w:rPr>
-        <w:t>AutoCloseable</w:t>
-      </w:r>
-      <w:proofErr w:type="spellEnd"/>
-      <w:r>
-        <w:rPr>
-          <w:spacing w:val="-8"/>
-          <w:lang w:val="en-US"/>
-        </w:rPr>
-        <w:t>.</w:t>
-      </w:r>
-    </w:p>
-    <w:p>
-      <w:pPr>
-        <w:numPr>
-          <w:ilvl w:val="0"/>
-          <w:numId w:val="10"/>
-        </w:numPr>
-        <w:rPr>
-          <w:spacing w:val="-8"/>
-          <w:lang w:val="en-US"/>
-        </w:rPr>
-      </w:pPr>
-      <w:proofErr w:type="spellStart"/>
-      <w:r>
-        <w:rPr>
-          <w:spacing w:val="-8"/>
-          <w:lang w:val="en-US"/>
-        </w:rPr>
-        <w:t>Definir</w:t>
-      </w:r>
-      <w:proofErr w:type="spellEnd"/>
-      <w:r>
-        <w:rPr>
-          <w:spacing w:val="-8"/>
-          <w:lang w:val="en-US"/>
-        </w:rPr>
-        <w:t xml:space="preserve"> </w:t>
-      </w:r>
-      <w:proofErr w:type="spellStart"/>
-      <w:r>
-        <w:rPr>
-          <w:spacing w:val="-8"/>
-          <w:lang w:val="en-US"/>
-        </w:rPr>
-        <w:t>el</w:t>
-      </w:r>
-      <w:proofErr w:type="spellEnd"/>
-      <w:r>
-        <w:rPr>
-          <w:spacing w:val="-8"/>
-          <w:lang w:val="en-US"/>
-        </w:rPr>
-        <w:t xml:space="preserve"> </w:t>
-      </w:r>
-      <w:proofErr w:type="spellStart"/>
-      <w:r>
-        <w:rPr>
-          <w:spacing w:val="-8"/>
-          <w:lang w:val="en-US"/>
-        </w:rPr>
-        <w:t>método</w:t>
-      </w:r>
-      <w:proofErr w:type="spellEnd"/>
-      <w:r>
-        <w:rPr>
-          <w:spacing w:val="-8"/>
-          <w:lang w:val="en-US"/>
-        </w:rPr>
-        <w:t xml:space="preserve"> </w:t>
-      </w:r>
-      <w:proofErr w:type="gramStart"/>
+        <w:t>close(</w:t>
+      </w:r>
+      <w:proofErr w:type="gramEnd"/>
       <w:r>
         <w:rPr>
           <w:b/>
@@ -4955,9 +4944,27 @@
           <w:spacing w:val="-8"/>
           <w:lang w:val="en-US"/>
         </w:rPr>
-        <w:t>close(</w:t>
-      </w:r>
-      <w:proofErr w:type="gramEnd"/>
+        <w:t>).</w:t>
+      </w:r>
+    </w:p>
+    <w:p>
+      <w:pPr>
+        <w:numPr>
+          <w:ilvl w:val="0"/>
+          <w:numId w:val="10"/>
+        </w:numPr>
+        <w:rPr>
+          <w:spacing w:val="-8"/>
+        </w:rPr>
+      </w:pPr>
+      <w:r>
+        <w:rPr>
+          <w:spacing w:val="-8"/>
+        </w:rPr>
+        <w:t xml:space="preserve">Hacer que </w:t>
+      </w:r>
+      <w:proofErr w:type="spellStart"/>
+      <w:proofErr w:type="gramStart"/>
       <w:r>
         <w:rPr>
           <w:b/>
@@ -4965,50 +4972,10 @@
           <w:i/>
           <w:iCs/>
           <w:spacing w:val="-8"/>
-          <w:lang w:val="en-US"/>
-        </w:rPr>
-        <w:t>).</w:t>
-      </w:r>
-    </w:p>
-    <w:p>
-      <w:pPr>
-        <w:numPr>
-          <w:ilvl w:val="0"/>
-          <w:numId w:val="10"/>
-        </w:numPr>
-        <w:rPr>
-          <w:spacing w:val="-8"/>
-        </w:rPr>
-      </w:pPr>
-      <w:r>
-        <w:rPr>
-          <w:spacing w:val="-8"/>
-        </w:rPr>
-        <w:t xml:space="preserve">Hacer que </w:t>
-      </w:r>
-      <w:proofErr w:type="spellStart"/>
-      <w:proofErr w:type="gramStart"/>
-      <w:r>
-        <w:rPr>
-          <w:spacing w:val="-8"/>
         </w:rPr>
         <w:t>close</w:t>
       </w:r>
       <w:proofErr w:type="spellEnd"/>
-      <w:r>
-        <w:rPr>
-          <w:spacing w:val="-8"/>
-        </w:rPr>
-        <w:t>(</w:t>
-      </w:r>
-      <w:proofErr w:type="gramEnd"/>
-      <w:r>
-        <w:rPr>
-          <w:spacing w:val="-8"/>
-        </w:rPr>
-        <w:t xml:space="preserve">) imprima exactamente: </w:t>
-      </w:r>
-      <w:proofErr w:type="spellStart"/>
       <w:r>
         <w:rPr>
           <w:b/>
@@ -5017,9 +4984,9 @@
           <w:iCs/>
           <w:spacing w:val="-8"/>
         </w:rPr>
-        <w:t>Chamber</w:t>
-      </w:r>
-      <w:proofErr w:type="spellEnd"/>
+        <w:t>(</w:t>
+      </w:r>
+      <w:proofErr w:type="gramEnd"/>
       <w:r>
         <w:rPr>
           <w:b/>
@@ -5028,7 +4995,23 @@
           <w:iCs/>
           <w:spacing w:val="-8"/>
         </w:rPr>
-        <w:t xml:space="preserve"> </w:t>
+        <w:t>)</w:t>
+      </w:r>
+      <w:r>
+        <w:rPr>
+          <w:spacing w:val="-8"/>
+        </w:rPr>
+        <w:t xml:space="preserve"> imprima exactamente: </w:t>
+      </w:r>
+      <w:r>
+        <w:rPr>
+          <w:b/>
+          <w:bCs/>
+          <w:i/>
+          <w:iCs/>
+          <w:spacing w:val="-8"/>
+        </w:rPr>
+        <w:t xml:space="preserve">Chamber </w:t>
       </w:r>
       <w:proofErr w:type="spellStart"/>
       <w:r>
@@ -5355,7 +5338,7 @@
         <w:jc w:val="left"/>
       </w:pPr>
       <w:bookmarkStart w:id="8" w:name="_bookmark4"/>
-      <w:bookmarkStart w:id="9" w:name="_Toc235822288"/>
+      <w:bookmarkStart w:id="9" w:name="_Toc235954442"/>
       <w:bookmarkEnd w:id="8"/>
       <w:r>
         <w:rPr>
@@ -5440,6 +5423,9 @@
         </w:tabs>
         <w:spacing w:line="293" w:lineRule="exact"/>
         <w:ind w:left="1341"/>
+        <w:rPr>
+          <w:spacing w:val="-2"/>
+        </w:rPr>
       </w:pPr>
       <w:r>
         <w:rPr>
@@ -5474,6 +5460,12 @@
           <w:spacing w:val="-2"/>
         </w:rPr>
         <w:t>a</w:t>
+      </w:r>
+      <w:r>
+        <w:rPr>
+          <w:spacing w:val="-2"/>
+        </w:rPr>
+        <w:t>, Demo.java</w:t>
       </w:r>
     </w:p>
     <w:p>
@@ -5524,46 +5516,7 @@
           <w:w w:val="90"/>
           <w:lang w:val="en-US"/>
         </w:rPr>
-        <w:t xml:space="preserve">public static void </w:t>
-      </w:r>
-      <w:proofErr w:type="gramStart"/>
-      <w:r>
-        <w:rPr>
-          <w:w w:val="90"/>
-          <w:lang w:val="en-US"/>
-        </w:rPr>
-        <w:t>main(</w:t>
-      </w:r>
-      <w:proofErr w:type="gramEnd"/>
-      <w:r>
-        <w:rPr>
-          <w:w w:val="90"/>
-          <w:lang w:val="en-US"/>
-        </w:rPr>
-        <w:t xml:space="preserve">String[] </w:t>
-      </w:r>
-      <w:proofErr w:type="spellStart"/>
-      <w:r>
-        <w:rPr>
-          <w:w w:val="90"/>
-          <w:lang w:val="en-US"/>
-        </w:rPr>
-        <w:t>args</w:t>
-      </w:r>
-      <w:proofErr w:type="spellEnd"/>
-      <w:r>
-        <w:rPr>
-          <w:w w:val="90"/>
-          <w:lang w:val="en-US"/>
-        </w:rPr>
-        <w:t>)</w:t>
-      </w:r>
-      <w:r>
-        <w:rPr>
-          <w:w w:val="90"/>
-          <w:lang w:val="en-US"/>
-        </w:rPr>
-        <w:t>.</w:t>
+        <w:t>Any.</w:t>
       </w:r>
     </w:p>
     <w:p>
@@ -5640,9 +5593,10 @@
           <w:spacing w:val="-6"/>
           <w:lang w:val="en-US"/>
         </w:rPr>
-        <w:t xml:space="preserve">, try/catch, </w:t>
+        <w:t xml:space="preserve">, try, </w:t>
       </w:r>
       <w:proofErr w:type="spellStart"/>
+      <w:proofErr w:type="gramStart"/>
       <w:r>
         <w:rPr>
           <w:spacing w:val="-6"/>
@@ -5651,6 +5605,25 @@
         <w:t>RuntimeException</w:t>
       </w:r>
       <w:proofErr w:type="spellEnd"/>
+      <w:r>
+        <w:rPr>
+          <w:spacing w:val="-2"/>
+        </w:rPr>
+        <w:t xml:space="preserve">, </w:t>
+      </w:r>
+      <w:r>
+        <w:rPr>
+          <w:spacing w:val="-2"/>
+        </w:rPr>
+        <w:t>@</w:t>
+      </w:r>
+      <w:proofErr w:type="gramEnd"/>
+      <w:r>
+        <w:rPr>
+          <w:spacing w:val="-2"/>
+        </w:rPr>
+        <w:t>Override</w:t>
+      </w:r>
     </w:p>
     <w:p>
       <w:pPr>
@@ -5746,6 +5719,33 @@
     </w:p>
     <w:p>
       <w:pPr>
+        <w:pStyle w:val="Prrafodelista"/>
+        <w:numPr>
+          <w:ilvl w:val="2"/>
+          <w:numId w:val="11"/>
+        </w:numPr>
+        <w:tabs>
+          <w:tab w:val="left" w:pos="1702"/>
+        </w:tabs>
+        <w:spacing w:before="2" w:line="252" w:lineRule="auto"/>
+        <w:ind w:right="1461"/>
+        <w:rPr>
+          <w:bCs/>
+          <w:i/>
+          <w:iCs/>
+        </w:rPr>
+      </w:pPr>
+      <w:r>
+        <w:rPr>
+          <w:bCs/>
+          <w:i/>
+          <w:iCs/>
+        </w:rPr>
+        <w:t>No usar el catch.</w:t>
+      </w:r>
+    </w:p>
+    <w:p>
+      <w:pPr>
         <w:pStyle w:val="Sinespaciado"/>
         <w:rPr>
           <w:lang w:val="es-ES"/>
@@ -5986,6 +5986,10 @@
       <w:proofErr w:type="spellStart"/>
       <w:r>
         <w:rPr>
+          <w:b/>
+          <w:bCs/>
+          <w:i/>
+          <w:iCs/>
           <w:spacing w:val="-6"/>
         </w:rPr>
         <w:t>RuntimeException</w:t>
@@ -6103,16 +6107,16 @@
         <mc:AlternateContent>
           <mc:Choice Requires="wps">
             <w:drawing>
-              <wp:anchor distT="0" distB="0" distL="114300" distR="114300" simplePos="0" relativeHeight="251653632" behindDoc="0" locked="0" layoutInCell="1" allowOverlap="1" wp14:anchorId="6EEA5942" wp14:editId="7F1C06E1">
+              <wp:anchor distT="0" distB="0" distL="114300" distR="114300" simplePos="0" relativeHeight="251653632" behindDoc="0" locked="0" layoutInCell="1" allowOverlap="1" wp14:anchorId="6EEA5942" wp14:editId="38B617B6">
                 <wp:simplePos x="0" y="0"/>
                 <wp:positionH relativeFrom="margin">
-                  <wp:posOffset>400050</wp:posOffset>
+                  <wp:posOffset>401128</wp:posOffset>
                 </wp:positionH>
                 <wp:positionV relativeFrom="paragraph">
-                  <wp:posOffset>77470</wp:posOffset>
+                  <wp:posOffset>74714</wp:posOffset>
                 </wp:positionV>
-                <wp:extent cx="5518205" cy="1028700"/>
-                <wp:effectExtent l="0" t="0" r="25400" b="19050"/>
+                <wp:extent cx="5518205" cy="1457864"/>
+                <wp:effectExtent l="0" t="0" r="25400" b="28575"/>
                 <wp:wrapNone/>
                 <wp:docPr id="1692332025" name="Rectángulo 2"/>
                 <wp:cNvGraphicFramePr/>
@@ -6123,7 +6127,7 @@
                       <wps:spPr>
                         <a:xfrm>
                           <a:off x="0" y="0"/>
-                          <a:ext cx="5518205" cy="1028700"/>
+                          <a:ext cx="5518205" cy="1457864"/>
                         </a:xfrm>
                         <a:prstGeom prst="rect">
                           <a:avLst/>
@@ -6160,19 +6164,89 @@
                               <w:pStyle w:val="Sinespaciado"/>
                               <w:rPr>
                                 <w:rFonts w:ascii="Cascadia Mono SemiBold" w:hAnsi="Cascadia Mono SemiBold" w:cs="Cascadia Mono SemiBold"/>
+                                <w:sz w:val="20"/>
+                                <w:szCs w:val="20"/>
                               </w:rPr>
                             </w:pPr>
                             <w:r>
                               <w:rPr>
                                 <w:rFonts w:ascii="Cascadia Mono SemiBold" w:hAnsi="Cascadia Mono SemiBold" w:cs="Cascadia Mono SemiBold"/>
+                                <w:sz w:val="20"/>
+                                <w:szCs w:val="20"/>
                               </w:rPr>
-                              <w:t xml:space="preserve">Opening containment chamber... ERROR: Gamma overload detected! Chamber sealed. Gamma levels stable. Exception in thread "main" </w:t>
+                              <w:t>Opening containment chamber...</w:t>
+                            </w:r>
+                          </w:p>
+                          <w:p>
+                            <w:pPr>
+                              <w:pStyle w:val="Sinespaciado"/>
+                              <w:rPr>
+                                <w:rFonts w:ascii="Cascadia Mono SemiBold" w:hAnsi="Cascadia Mono SemiBold" w:cs="Cascadia Mono SemiBold"/>
+                                <w:sz w:val="20"/>
+                                <w:szCs w:val="20"/>
+                              </w:rPr>
+                            </w:pPr>
+                          </w:p>
+                          <w:p>
+                            <w:pPr>
+                              <w:pStyle w:val="Sinespaciado"/>
+                              <w:rPr>
+                                <w:rFonts w:ascii="Cascadia Mono SemiBold" w:hAnsi="Cascadia Mono SemiBold" w:cs="Cascadia Mono SemiBold"/>
+                                <w:sz w:val="20"/>
+                                <w:szCs w:val="20"/>
+                              </w:rPr>
+                            </w:pPr>
+                            <w:r>
+                              <w:rPr>
+                                <w:rFonts w:ascii="Cascadia Mono SemiBold" w:hAnsi="Cascadia Mono SemiBold" w:cs="Cascadia Mono SemiBold"/>
+                                <w:sz w:val="20"/>
+                                <w:szCs w:val="20"/>
+                              </w:rPr>
+                              <w:t>ERROR: Gamma detected!</w:t>
+                            </w:r>
+                          </w:p>
+                          <w:p>
+                            <w:pPr>
+                              <w:pStyle w:val="Sinespaciado"/>
+                              <w:rPr>
+                                <w:rFonts w:ascii="Cascadia Mono SemiBold" w:hAnsi="Cascadia Mono SemiBold" w:cs="Cascadia Mono SemiBold"/>
+                                <w:sz w:val="20"/>
+                                <w:szCs w:val="20"/>
+                              </w:rPr>
+                            </w:pPr>
+                            <w:r>
+                              <w:rPr>
+                                <w:rFonts w:ascii="Cascadia Mono SemiBold" w:hAnsi="Cascadia Mono SemiBold" w:cs="Cascadia Mono SemiBold"/>
+                                <w:sz w:val="20"/>
+                                <w:szCs w:val="20"/>
+                              </w:rPr>
+                              <w:t>Chamber sealed. Gamma levels stable.</w:t>
+                            </w:r>
+                          </w:p>
+                          <w:p>
+                            <w:pPr>
+                              <w:pStyle w:val="Sinespaciado"/>
+                              <w:rPr>
+                                <w:rFonts w:ascii="Cascadia Mono SemiBold" w:hAnsi="Cascadia Mono SemiBold" w:cs="Cascadia Mono SemiBold"/>
+                                <w:sz w:val="20"/>
+                                <w:szCs w:val="20"/>
+                              </w:rPr>
+                            </w:pPr>
+                            <w:r>
+                              <w:rPr>
+                                <w:rFonts w:ascii="Cascadia Mono SemiBold" w:hAnsi="Cascadia Mono SemiBold" w:cs="Cascadia Mono SemiBold"/>
+                                <w:sz w:val="20"/>
+                                <w:szCs w:val="20"/>
+                              </w:rPr>
+                              <w:t xml:space="preserve">Exception in thread "main" </w:t>
                             </w:r>
                             <w:proofErr w:type="spellStart"/>
                             <w:proofErr w:type="gramStart"/>
                             <w:r>
                               <w:rPr>
                                 <w:rFonts w:ascii="Cascadia Mono SemiBold" w:hAnsi="Cascadia Mono SemiBold" w:cs="Cascadia Mono SemiBold"/>
+                                <w:sz w:val="20"/>
+                                <w:szCs w:val="20"/>
                               </w:rPr>
                               <w:t>java.lang</w:t>
                             </w:r>
@@ -6180,6 +6254,8 @@
                             <w:r>
                               <w:rPr>
                                 <w:rFonts w:ascii="Cascadia Mono SemiBold" w:hAnsi="Cascadia Mono SemiBold" w:cs="Cascadia Mono SemiBold"/>
+                                <w:sz w:val="20"/>
+                                <w:szCs w:val="20"/>
                               </w:rPr>
                               <w:t>.RuntimeException</w:t>
                             </w:r>
@@ -6187,8 +6263,82 @@
                             <w:r>
                               <w:rPr>
                                 <w:rFonts w:ascii="Cascadia Mono SemiBold" w:hAnsi="Cascadia Mono SemiBold" w:cs="Cascadia Mono SemiBold"/>
+                                <w:sz w:val="20"/>
+                                <w:szCs w:val="20"/>
                               </w:rPr>
-                              <w:t>: Gamma overload detected!</w:t>
+                              <w:t>: Gamma specific overload detected!</w:t>
+                            </w:r>
+                          </w:p>
+                          <w:p>
+                            <w:pPr>
+                              <w:pStyle w:val="Sinespaciado"/>
+                              <w:rPr>
+                                <w:rFonts w:ascii="Cascadia Mono SemiBold" w:hAnsi="Cascadia Mono SemiBold" w:cs="Cascadia Mono SemiBold"/>
+                                <w:sz w:val="20"/>
+                                <w:szCs w:val="20"/>
+                              </w:rPr>
+                            </w:pPr>
+                            <w:r>
+                              <w:rPr>
+                                <w:rFonts w:ascii="Cascadia Mono SemiBold" w:hAnsi="Cascadia Mono SemiBold" w:cs="Cascadia Mono SemiBold"/>
+                                <w:sz w:val="20"/>
+                                <w:szCs w:val="20"/>
+                              </w:rPr>
+                              <w:t xml:space="preserve">        at </w:t>
+                            </w:r>
+                            <w:proofErr w:type="gramStart"/>
+                            <w:r>
+                              <w:rPr>
+                                <w:rFonts w:ascii="Cascadia Mono SemiBold" w:hAnsi="Cascadia Mono SemiBold" w:cs="Cascadia Mono SemiBold"/>
+                                <w:sz w:val="20"/>
+                                <w:szCs w:val="20"/>
+                              </w:rPr>
+                              <w:t>ex1.HulkOutbreak.Work</w:t>
+                            </w:r>
+                            <w:proofErr w:type="gramEnd"/>
+                            <w:r>
+                              <w:rPr>
+                                <w:rFonts w:ascii="Cascadia Mono SemiBold" w:hAnsi="Cascadia Mono SemiBold" w:cs="Cascadia Mono SemiBold"/>
+                                <w:sz w:val="20"/>
+                                <w:szCs w:val="20"/>
+                              </w:rPr>
+                              <w:t>(HulkOutbreak.java:9)</w:t>
+                            </w:r>
+                          </w:p>
+                          <w:p>
+                            <w:pPr>
+                              <w:pStyle w:val="Sinespaciado"/>
+                              <w:rPr>
+                                <w:rFonts w:ascii="Cascadia Mono SemiBold" w:hAnsi="Cascadia Mono SemiBold" w:cs="Cascadia Mono SemiBold"/>
+                                <w:sz w:val="20"/>
+                                <w:szCs w:val="20"/>
+                              </w:rPr>
+                            </w:pPr>
+                            <w:r>
+                              <w:rPr>
+                                <w:rFonts w:ascii="Cascadia Mono SemiBold" w:hAnsi="Cascadia Mono SemiBold" w:cs="Cascadia Mono SemiBold"/>
+                                <w:sz w:val="20"/>
+                                <w:szCs w:val="20"/>
+                              </w:rPr>
+                              <w:t xml:space="preserve">        at </w:t>
+                            </w:r>
+                            <w:proofErr w:type="gramStart"/>
+                            <w:r>
+                              <w:rPr>
+                                <w:rFonts w:ascii="Cascadia Mono SemiBold" w:hAnsi="Cascadia Mono SemiBold" w:cs="Cascadia Mono SemiBold"/>
+                                <w:sz w:val="20"/>
+                                <w:szCs w:val="20"/>
+                              </w:rPr>
+                              <w:t>ex1.Demo.main</w:t>
+                            </w:r>
+                            <w:proofErr w:type="gramEnd"/>
+                            <w:r>
+                              <w:rPr>
+                                <w:rFonts w:ascii="Cascadia Mono SemiBold" w:hAnsi="Cascadia Mono SemiBold" w:cs="Cascadia Mono SemiBold"/>
+                                <w:sz w:val="20"/>
+                                <w:szCs w:val="20"/>
+                              </w:rPr>
+                              <w:t>(Demo.java:6)</w:t>
                             </w:r>
                           </w:p>
                         </w:txbxContent>
@@ -6213,7 +6363,7 @@
           </mc:Choice>
           <mc:Fallback>
             <w:pict>
-              <v:rect w14:anchorId="6EEA5942" id="_x0000_s1027" style="position:absolute;left:0;text-align:left;margin-left:31.5pt;margin-top:6.1pt;width:434.5pt;height:81pt;z-index:251653632;visibility:visible;mso-wrap-style:square;mso-width-percent:0;mso-height-percent:0;mso-wrap-distance-left:9pt;mso-wrap-distance-top:0;mso-wrap-distance-right:9pt;mso-wrap-distance-bottom:0;mso-position-horizontal:absolute;mso-position-horizontal-relative:margin;mso-position-vertical:absolute;mso-position-vertical-relative:text;mso-width-percent:0;mso-height-percent:0;mso-width-relative:margin;mso-height-relative:margin;v-text-anchor:middle" o:gfxdata="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" fillcolor="black [3213]" strokecolor="black [3213]" strokeweight="2pt">
+              <v:rect w14:anchorId="6EEA5942" id="_x0000_s1027" style="position:absolute;left:0;text-align:left;margin-left:31.6pt;margin-top:5.9pt;width:434.5pt;height:114.8pt;z-index:251653632;visibility:visible;mso-wrap-style:square;mso-width-percent:0;mso-height-percent:0;mso-wrap-distance-left:9pt;mso-wrap-distance-top:0;mso-wrap-distance-right:9pt;mso-wrap-distance-bottom:0;mso-position-horizontal:absolute;mso-position-horizontal-relative:margin;mso-position-vertical:absolute;mso-position-vertical-relative:text;mso-width-percent:0;mso-height-percent:0;mso-width-relative:margin;mso-height-relative:margin;v-text-anchor:middle" o:gfxdata="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" fillcolor="black [3213]" strokecolor="black [3213]" strokeweight="2pt">
                 <v:textbox>
                   <w:txbxContent>
                     <w:p>
@@ -6221,19 +6371,89 @@
                         <w:pStyle w:val="Sinespaciado"/>
                         <w:rPr>
                           <w:rFonts w:ascii="Cascadia Mono SemiBold" w:hAnsi="Cascadia Mono SemiBold" w:cs="Cascadia Mono SemiBold"/>
+                          <w:sz w:val="20"/>
+                          <w:szCs w:val="20"/>
                         </w:rPr>
                       </w:pPr>
                       <w:r>
                         <w:rPr>
                           <w:rFonts w:ascii="Cascadia Mono SemiBold" w:hAnsi="Cascadia Mono SemiBold" w:cs="Cascadia Mono SemiBold"/>
+                          <w:sz w:val="20"/>
+                          <w:szCs w:val="20"/>
                         </w:rPr>
-                        <w:t xml:space="preserve">Opening containment chamber... ERROR: Gamma overload detected! Chamber sealed. Gamma levels stable. Exception in thread "main" </w:t>
+                        <w:t>Opening containment chamber...</w:t>
+                      </w:r>
+                    </w:p>
+                    <w:p>
+                      <w:pPr>
+                        <w:pStyle w:val="Sinespaciado"/>
+                        <w:rPr>
+                          <w:rFonts w:ascii="Cascadia Mono SemiBold" w:hAnsi="Cascadia Mono SemiBold" w:cs="Cascadia Mono SemiBold"/>
+                          <w:sz w:val="20"/>
+                          <w:szCs w:val="20"/>
+                        </w:rPr>
+                      </w:pPr>
+                    </w:p>
+                    <w:p>
+                      <w:pPr>
+                        <w:pStyle w:val="Sinespaciado"/>
+                        <w:rPr>
+                          <w:rFonts w:ascii="Cascadia Mono SemiBold" w:hAnsi="Cascadia Mono SemiBold" w:cs="Cascadia Mono SemiBold"/>
+                          <w:sz w:val="20"/>
+                          <w:szCs w:val="20"/>
+                        </w:rPr>
+                      </w:pPr>
+                      <w:r>
+                        <w:rPr>
+                          <w:rFonts w:ascii="Cascadia Mono SemiBold" w:hAnsi="Cascadia Mono SemiBold" w:cs="Cascadia Mono SemiBold"/>
+                          <w:sz w:val="20"/>
+                          <w:szCs w:val="20"/>
+                        </w:rPr>
+                        <w:t>ERROR: Gamma detected!</w:t>
+                      </w:r>
+                    </w:p>
+                    <w:p>
+                      <w:pPr>
+                        <w:pStyle w:val="Sinespaciado"/>
+                        <w:rPr>
+                          <w:rFonts w:ascii="Cascadia Mono SemiBold" w:hAnsi="Cascadia Mono SemiBold" w:cs="Cascadia Mono SemiBold"/>
+                          <w:sz w:val="20"/>
+                          <w:szCs w:val="20"/>
+                        </w:rPr>
+                      </w:pPr>
+                      <w:r>
+                        <w:rPr>
+                          <w:rFonts w:ascii="Cascadia Mono SemiBold" w:hAnsi="Cascadia Mono SemiBold" w:cs="Cascadia Mono SemiBold"/>
+                          <w:sz w:val="20"/>
+                          <w:szCs w:val="20"/>
+                        </w:rPr>
+                        <w:t>Chamber sealed. Gamma levels stable.</w:t>
+                      </w:r>
+                    </w:p>
+                    <w:p>
+                      <w:pPr>
+                        <w:pStyle w:val="Sinespaciado"/>
+                        <w:rPr>
+                          <w:rFonts w:ascii="Cascadia Mono SemiBold" w:hAnsi="Cascadia Mono SemiBold" w:cs="Cascadia Mono SemiBold"/>
+                          <w:sz w:val="20"/>
+                          <w:szCs w:val="20"/>
+                        </w:rPr>
+                      </w:pPr>
+                      <w:r>
+                        <w:rPr>
+                          <w:rFonts w:ascii="Cascadia Mono SemiBold" w:hAnsi="Cascadia Mono SemiBold" w:cs="Cascadia Mono SemiBold"/>
+                          <w:sz w:val="20"/>
+                          <w:szCs w:val="20"/>
+                        </w:rPr>
+                        <w:t xml:space="preserve">Exception in thread "main" </w:t>
                       </w:r>
                       <w:proofErr w:type="spellStart"/>
                       <w:proofErr w:type="gramStart"/>
                       <w:r>
                         <w:rPr>
                           <w:rFonts w:ascii="Cascadia Mono SemiBold" w:hAnsi="Cascadia Mono SemiBold" w:cs="Cascadia Mono SemiBold"/>
+                          <w:sz w:val="20"/>
+                          <w:szCs w:val="20"/>
                         </w:rPr>
                         <w:t>java.lang</w:t>
                       </w:r>
@@ -6241,6 +6461,8 @@
                       <w:r>
                         <w:rPr>
                           <w:rFonts w:ascii="Cascadia Mono SemiBold" w:hAnsi="Cascadia Mono SemiBold" w:cs="Cascadia Mono SemiBold"/>
+                          <w:sz w:val="20"/>
+                          <w:szCs w:val="20"/>
                         </w:rPr>
                         <w:t>.RuntimeException</w:t>
                       </w:r>
@@ -6248,8 +6470,82 @@
                       <w:r>
                         <w:rPr>
                           <w:rFonts w:ascii="Cascadia Mono SemiBold" w:hAnsi="Cascadia Mono SemiBold" w:cs="Cascadia Mono SemiBold"/>
+                          <w:sz w:val="20"/>
+                          <w:szCs w:val="20"/>
                         </w:rPr>
-                        <w:t>: Gamma overload detected!</w:t>
+                        <w:t>: Gamma specific overload detected!</w:t>
+                      </w:r>
+                    </w:p>
+                    <w:p>
+                      <w:pPr>
+                        <w:pStyle w:val="Sinespaciado"/>
+                        <w:rPr>
+                          <w:rFonts w:ascii="Cascadia Mono SemiBold" w:hAnsi="Cascadia Mono SemiBold" w:cs="Cascadia Mono SemiBold"/>
+                          <w:sz w:val="20"/>
+                          <w:szCs w:val="20"/>
+                        </w:rPr>
+                      </w:pPr>
+                      <w:r>
+                        <w:rPr>
+                          <w:rFonts w:ascii="Cascadia Mono SemiBold" w:hAnsi="Cascadia Mono SemiBold" w:cs="Cascadia Mono SemiBold"/>
+                          <w:sz w:val="20"/>
+                          <w:szCs w:val="20"/>
+                        </w:rPr>
+                        <w:t xml:space="preserve">        at </w:t>
+                      </w:r>
+                      <w:proofErr w:type="gramStart"/>
+                      <w:r>
+                        <w:rPr>
+                          <w:rFonts w:ascii="Cascadia Mono SemiBold" w:hAnsi="Cascadia Mono SemiBold" w:cs="Cascadia Mono SemiBold"/>
+                          <w:sz w:val="20"/>
+                          <w:szCs w:val="20"/>
+                        </w:rPr>
+                        <w:t>ex1.HulkOutbreak.Work</w:t>
+                      </w:r>
+                      <w:proofErr w:type="gramEnd"/>
+                      <w:r>
+                        <w:rPr>
+                          <w:rFonts w:ascii="Cascadia Mono SemiBold" w:hAnsi="Cascadia Mono SemiBold" w:cs="Cascadia Mono SemiBold"/>
+                          <w:sz w:val="20"/>
+                          <w:szCs w:val="20"/>
+                        </w:rPr>
+                        <w:t>(HulkOutbreak.java:9)</w:t>
+                      </w:r>
+                    </w:p>
+                    <w:p>
+                      <w:pPr>
+                        <w:pStyle w:val="Sinespaciado"/>
+                        <w:rPr>
+                          <w:rFonts w:ascii="Cascadia Mono SemiBold" w:hAnsi="Cascadia Mono SemiBold" w:cs="Cascadia Mono SemiBold"/>
+                          <w:sz w:val="20"/>
+                          <w:szCs w:val="20"/>
+                        </w:rPr>
+                      </w:pPr>
+                      <w:r>
+                        <w:rPr>
+                          <w:rFonts w:ascii="Cascadia Mono SemiBold" w:hAnsi="Cascadia Mono SemiBold" w:cs="Cascadia Mono SemiBold"/>
+                          <w:sz w:val="20"/>
+                          <w:szCs w:val="20"/>
+                        </w:rPr>
+                        <w:t xml:space="preserve">        at </w:t>
+                      </w:r>
+                      <w:proofErr w:type="gramStart"/>
+                      <w:r>
+                        <w:rPr>
+                          <w:rFonts w:ascii="Cascadia Mono SemiBold" w:hAnsi="Cascadia Mono SemiBold" w:cs="Cascadia Mono SemiBold"/>
+                          <w:sz w:val="20"/>
+                          <w:szCs w:val="20"/>
+                        </w:rPr>
+                        <w:t>ex1.Demo.main</w:t>
+                      </w:r>
+                      <w:proofErr w:type="gramEnd"/>
+                      <w:r>
+                        <w:rPr>
+                          <w:rFonts w:ascii="Cascadia Mono SemiBold" w:hAnsi="Cascadia Mono SemiBold" w:cs="Cascadia Mono SemiBold"/>
+                          <w:sz w:val="20"/>
+                          <w:szCs w:val="20"/>
+                        </w:rPr>
+                        <w:t>(Demo.java:6)</w:t>
                       </w:r>
                     </w:p>
                   </w:txbxContent>
@@ -6303,7 +6599,7 @@
         <w:jc w:val="left"/>
       </w:pPr>
       <w:bookmarkStart w:id="10" w:name="_bookmark5"/>
-      <w:bookmarkStart w:id="11" w:name="_Toc235822289"/>
+      <w:bookmarkStart w:id="11" w:name="_Toc235954443"/>
       <w:bookmarkEnd w:id="10"/>
       <w:r>
         <w:rPr>
@@ -6388,34 +6684,66 @@
         </w:tabs>
         <w:spacing w:line="293" w:lineRule="exact"/>
         <w:ind w:left="1341"/>
-      </w:pPr>
+        <w:rPr>
+          <w:lang w:val="en-US"/>
+        </w:rPr>
+      </w:pPr>
+      <w:proofErr w:type="spellStart"/>
       <w:r>
         <w:rPr>
           <w:b/>
           <w:spacing w:val="-2"/>
           <w:w w:val="90"/>
-        </w:rPr>
-        <w:t>Archivo:</w:t>
+          <w:lang w:val="en-US"/>
+        </w:rPr>
+        <w:t>Archivo</w:t>
+      </w:r>
+      <w:proofErr w:type="spellEnd"/>
+      <w:r>
+        <w:rPr>
+          <w:b/>
+          <w:spacing w:val="-2"/>
+          <w:w w:val="90"/>
+          <w:lang w:val="en-US"/>
+        </w:rPr>
+        <w:t>:</w:t>
       </w:r>
       <w:r>
         <w:rPr>
           <w:b/>
           <w:spacing w:val="-6"/>
           <w:w w:val="90"/>
+          <w:lang w:val="en-US"/>
         </w:rPr>
         <w:t xml:space="preserve"> </w:t>
       </w:r>
       <w:r>
         <w:rPr>
           <w:spacing w:val="-2"/>
+          <w:lang w:val="en-US"/>
         </w:rPr>
         <w:t>MultiChamberLab</w:t>
       </w:r>
       <w:r>
         <w:rPr>
           <w:spacing w:val="-2"/>
+          <w:lang w:val="en-US"/>
         </w:rPr>
         <w:t>.java</w:t>
+      </w:r>
+      <w:r>
+        <w:rPr>
+          <w:spacing w:val="-2"/>
+          <w:lang w:val="en-US"/>
+        </w:rPr>
+        <w:t xml:space="preserve">, </w:t>
+      </w:r>
+      <w:r>
+        <w:rPr>
+          <w:spacing w:val="-2"/>
+          <w:lang w:val="en-US"/>
+        </w:rPr>
+        <w:t>ContainmentChamber.java</w:t>
       </w:r>
     </w:p>
     <w:p>
@@ -6542,7 +6870,30 @@
           <w:w w:val="90"/>
           <w:lang w:val="en-US"/>
         </w:rPr>
-        <w:t>, try-with-resources</w:t>
+        <w:t>, try-with-</w:t>
+      </w:r>
+      <w:proofErr w:type="gramStart"/>
+      <w:r>
+        <w:rPr>
+          <w:w w:val="90"/>
+          <w:lang w:val="en-US"/>
+        </w:rPr>
+        <w:t>resources</w:t>
+      </w:r>
+      <w:r>
+        <w:rPr>
+          <w:w w:val="90"/>
+          <w:lang w:val="en-US"/>
+        </w:rPr>
+        <w:t>, @</w:t>
+      </w:r>
+      <w:proofErr w:type="gramEnd"/>
+      <w:r>
+        <w:rPr>
+          <w:w w:val="90"/>
+          <w:lang w:val="en-US"/>
+        </w:rPr>
+        <w:t>Override</w:t>
       </w:r>
     </w:p>
     <w:p>
@@ -6787,6 +7138,11 @@
         </w:rPr>
         <w:t>Requisitos</w:t>
       </w:r>
+    </w:p>
+    <w:p>
+      <w:pPr>
+        <w:pStyle w:val="Sinespaciado"/>
+      </w:pPr>
     </w:p>
     <w:p>
       <w:pPr>
@@ -7312,13 +7668,17 @@
           <w:numId w:val="6"/>
         </w:numPr>
         <w:jc w:val="left"/>
+        <w:rPr>
+          <w:highlight w:val="yellow"/>
+        </w:rPr>
       </w:pPr>
       <w:bookmarkStart w:id="12" w:name="_bookmark6"/>
-      <w:bookmarkStart w:id="13" w:name="_Toc235822290"/>
+      <w:bookmarkStart w:id="13" w:name="_Toc235954444"/>
       <w:bookmarkEnd w:id="12"/>
       <w:r>
         <w:rPr>
           <w:w w:val="90"/>
+          <w:highlight w:val="yellow"/>
         </w:rPr>
         <w:lastRenderedPageBreak/>
         <w:t>Ejercicio</w:t>
@@ -7327,12 +7687,14 @@
         <w:rPr>
           <w:spacing w:val="-7"/>
           <w:w w:val="90"/>
+          <w:highlight w:val="yellow"/>
         </w:rPr>
         <w:t xml:space="preserve"> </w:t>
       </w:r>
       <w:r>
         <w:rPr>
           <w:w w:val="90"/>
+          <w:highlight w:val="yellow"/>
         </w:rPr>
         <w:t>3:</w:t>
       </w:r>
@@ -7340,12 +7702,14 @@
         <w:rPr>
           <w:spacing w:val="-4"/>
           <w:w w:val="90"/>
+          <w:highlight w:val="yellow"/>
         </w:rPr>
         <w:t xml:space="preserve"> </w:t>
       </w:r>
       <w:r>
         <w:rPr>
           <w:w w:val="90"/>
+          <w:highlight w:val="yellow"/>
         </w:rPr>
         <w:t>El Reactor que No Quiere Cerrar</w:t>
       </w:r>
@@ -8493,7 +8857,7 @@
         <w:jc w:val="left"/>
       </w:pPr>
       <w:bookmarkStart w:id="14" w:name="_bookmark7"/>
-      <w:bookmarkStart w:id="15" w:name="_Toc235822291"/>
+      <w:bookmarkStart w:id="15" w:name="_Toc235954445"/>
       <w:bookmarkEnd w:id="14"/>
       <w:r>
         <w:rPr>
@@ -9100,15 +9464,7 @@
       </w:r>
       <w:proofErr w:type="spellEnd"/>
       <w:r>
-        <w:t xml:space="preserve"> </w:t>
-      </w:r>
-      <w:proofErr w:type="spellStart"/>
-      <w:r>
-        <w:t>el</w:t>
-      </w:r>
-      <w:proofErr w:type="spellEnd"/>
-      <w:r>
-        <w:t xml:space="preserve"> </w:t>
+        <w:t xml:space="preserve"> el </w:t>
       </w:r>
       <w:proofErr w:type="spellStart"/>
       <w:r>
@@ -9462,7 +9818,7 @@
         <w:jc w:val="left"/>
       </w:pPr>
       <w:bookmarkStart w:id="16" w:name="_bookmark8"/>
-      <w:bookmarkStart w:id="17" w:name="_Toc235822292"/>
+      <w:bookmarkStart w:id="17" w:name="_Toc235954446"/>
       <w:bookmarkEnd w:id="16"/>
       <w:r>
         <w:rPr>
@@ -9879,7 +10235,7 @@
       </w:pPr>
       <w:bookmarkStart w:id="18" w:name="_bookmark9"/>
       <w:bookmarkStart w:id="19" w:name="_Toc234568067"/>
-      <w:bookmarkStart w:id="20" w:name="_Toc235822293"/>
+      <w:bookmarkStart w:id="20" w:name="_Toc235954447"/>
       <w:bookmarkEnd w:id="18"/>
       <w:r>
         <w:lastRenderedPageBreak/>
@@ -10337,18 +10693,8 @@
                                 <w:sz w:val="20"/>
                                 <w:szCs w:val="20"/>
                               </w:rPr>
-                              <w:t>."</w:t>
+                              <w:t>.");</w:t>
                             </w:r>
-                            <w:proofErr w:type="gramStart"/>
-                            <w:r>
-                              <w:rPr>
-                                <w:rFonts w:ascii="Cascadia Mono SemiBold" w:hAnsi="Cascadia Mono SemiBold" w:cs="Cascadia Mono SemiBold"/>
-                                <w:sz w:val="20"/>
-                                <w:szCs w:val="20"/>
-                              </w:rPr>
-                              <w:t>);</w:t>
-                            </w:r>
-                            <w:proofErr w:type="gramEnd"/>
                           </w:p>
                           <w:p>
                             <w:pPr>
@@ -10700,18 +11046,8 @@
                           <w:sz w:val="20"/>
                           <w:szCs w:val="20"/>
                         </w:rPr>
-                        <w:t>."</w:t>
+                        <w:t>.");</w:t>
                       </w:r>
-                      <w:proofErr w:type="gramStart"/>
-                      <w:r>
-                        <w:rPr>
-                          <w:rFonts w:ascii="Cascadia Mono SemiBold" w:hAnsi="Cascadia Mono SemiBold" w:cs="Cascadia Mono SemiBold"/>
-                          <w:sz w:val="20"/>
-                          <w:szCs w:val="20"/>
-                        </w:rPr>
-                        <w:t>);</w:t>
-                      </w:r>
-                      <w:proofErr w:type="gramEnd"/>
                     </w:p>
                     <w:p>
                       <w:pPr>
@@ -11137,15 +11473,7 @@
       </w:r>
       <w:proofErr w:type="spellEnd"/>
       <w:r>
-        <w:t xml:space="preserve"> </w:t>
-      </w:r>
-      <w:proofErr w:type="spellStart"/>
-      <w:r>
-        <w:t>el</w:t>
-      </w:r>
-      <w:proofErr w:type="spellEnd"/>
-      <w:r>
-        <w:t xml:space="preserve"> </w:t>
+        <w:t xml:space="preserve"> el </w:t>
       </w:r>
       <w:proofErr w:type="spellStart"/>
       <w:r>
@@ -11455,6 +11783,7 @@
         <w:t xml:space="preserve"> "Error: " + </w:t>
       </w:r>
       <w:proofErr w:type="spellStart"/>
+      <w:proofErr w:type="gramStart"/>
       <w:r>
         <w:rPr>
           <w:b/>
@@ -11466,6 +11795,7 @@
         <w:t>e.getMessage</w:t>
       </w:r>
       <w:proofErr w:type="spellEnd"/>
+      <w:proofErr w:type="gramEnd"/>
       <w:r>
         <w:rPr>
           <w:b/>
@@ -12157,7 +12487,7 @@
         <w:ind w:left="0" w:firstLine="622"/>
       </w:pPr>
       <w:bookmarkStart w:id="21" w:name="_bookmark11"/>
-      <w:bookmarkStart w:id="22" w:name="_Toc235822294"/>
+      <w:bookmarkStart w:id="22" w:name="_Toc235954448"/>
       <w:bookmarkEnd w:id="21"/>
       <w:r>
         <w:lastRenderedPageBreak/>
@@ -13317,7 +13647,7 @@
         </mc:Choice>
         <mc:Fallback>
           <w:pict>
-            <v:shape w14:anchorId="5D7AB82D" id="Graphic 4" o:spid="_x0000_s1026" style="position:absolute;margin-left:86.45pt;margin-top:719.75pt;width:476.5pt;height:25.2pt;z-index:-251660288;visibility:visible;mso-wrap-style:square;mso-wrap-distance-left:0;mso-wrap-distance-top:0;mso-wrap-distance-right:0;mso-wrap-distance-bottom:0;mso-position-horizontal:absolute;mso-position-horizontal-relative:page;mso-position-vertical:absolute;mso-position-vertical-relative:page;v-text-anchor:top" coordsize="6051550,320040" o:gfxdata="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" path="m6051397,l5594197,,,12,,18605r5594197,l5594197,320040r457200,l6051397,xe" fillcolor="black" stroked="f">
+            <v:shape w14:anchorId="72B59559" id="Graphic 4" o:spid="_x0000_s1026" style="position:absolute;margin-left:86.45pt;margin-top:719.75pt;width:476.5pt;height:25.2pt;z-index:-251660288;visibility:visible;mso-wrap-style:square;mso-wrap-distance-left:0;mso-wrap-distance-top:0;mso-wrap-distance-right:0;mso-wrap-distance-bottom:0;mso-position-horizontal:absolute;mso-position-horizontal-relative:page;mso-position-vertical:absolute;mso-position-vertical-relative:page;v-text-anchor:top" coordsize="6051550,320040" o:gfxdata="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" path="m6051397,l5594197,,,12,,18605r5594197,l5594197,320040r457200,l6051397,xe" fillcolor="black" stroked="f">
               <v:path arrowok="t"/>
               <w10:wrap anchorx="page" anchory="page"/>
             </v:shape>
@@ -14799,9 +15129,9 @@
       <w:lvlJc w:val="left"/>
       <w:pPr>
         <w:tabs>
-          <w:tab w:val="num" w:pos="982"/>
+          <w:tab w:val="num" w:pos="1080"/>
         </w:tabs>
-        <w:ind w:left="982" w:hanging="360"/>
+        <w:ind w:left="1080" w:hanging="360"/>
       </w:pPr>
       <w:rPr>
         <w:rFonts w:ascii="Wingdings" w:hAnsi="Wingdings" w:hint="default"/>
@@ -14815,9 +15145,9 @@
       <w:lvlJc w:val="left"/>
       <w:pPr>
         <w:tabs>
-          <w:tab w:val="num" w:pos="1702"/>
+          <w:tab w:val="num" w:pos="1800"/>
         </w:tabs>
-        <w:ind w:left="1702" w:hanging="360"/>
+        <w:ind w:left="1800" w:hanging="360"/>
       </w:pPr>
       <w:rPr>
         <w:rFonts w:ascii="Courier New" w:hAnsi="Courier New" w:hint="default"/>
@@ -14831,9 +15161,9 @@
       <w:lvlJc w:val="left"/>
       <w:pPr>
         <w:tabs>
-          <w:tab w:val="num" w:pos="2422"/>
+          <w:tab w:val="num" w:pos="2520"/>
         </w:tabs>
-        <w:ind w:left="2422" w:hanging="360"/>
+        <w:ind w:left="2520" w:hanging="360"/>
       </w:pPr>
       <w:rPr>
         <w:rFonts w:ascii="Wingdings" w:hAnsi="Wingdings" w:hint="default"/>
@@ -14847,9 +15177,9 @@
       <w:lvlJc w:val="left"/>
       <w:pPr>
         <w:tabs>
-          <w:tab w:val="num" w:pos="3142"/>
+          <w:tab w:val="num" w:pos="3240"/>
         </w:tabs>
-        <w:ind w:left="3142" w:hanging="360"/>
+        <w:ind w:left="3240" w:hanging="360"/>
       </w:pPr>
       <w:rPr>
         <w:rFonts w:ascii="Wingdings" w:hAnsi="Wingdings" w:hint="default"/>
@@ -14863,9 +15193,9 @@
       <w:lvlJc w:val="left"/>
       <w:pPr>
         <w:tabs>
-          <w:tab w:val="num" w:pos="3862"/>
+          <w:tab w:val="num" w:pos="3960"/>
         </w:tabs>
-        <w:ind w:left="3862" w:hanging="360"/>
+        <w:ind w:left="3960" w:hanging="360"/>
       </w:pPr>
       <w:rPr>
         <w:rFonts w:ascii="Wingdings" w:hAnsi="Wingdings" w:hint="default"/>
@@ -14879,9 +15209,9 @@
       <w:lvlJc w:val="left"/>
       <w:pPr>
         <w:tabs>
-          <w:tab w:val="num" w:pos="4582"/>
+          <w:tab w:val="num" w:pos="4680"/>
         </w:tabs>
-        <w:ind w:left="4582" w:hanging="360"/>
+        <w:ind w:left="4680" w:hanging="360"/>
       </w:pPr>
       <w:rPr>
         <w:rFonts w:ascii="Wingdings" w:hAnsi="Wingdings" w:hint="default"/>
@@ -14895,9 +15225,9 @@
       <w:lvlJc w:val="left"/>
       <w:pPr>
         <w:tabs>
-          <w:tab w:val="num" w:pos="5302"/>
+          <w:tab w:val="num" w:pos="5400"/>
         </w:tabs>
-        <w:ind w:left="5302" w:hanging="360"/>
+        <w:ind w:left="5400" w:hanging="360"/>
       </w:pPr>
       <w:rPr>
         <w:rFonts w:ascii="Wingdings" w:hAnsi="Wingdings" w:hint="default"/>
@@ -14911,9 +15241,9 @@
       <w:lvlJc w:val="left"/>
       <w:pPr>
         <w:tabs>
-          <w:tab w:val="num" w:pos="6022"/>
+          <w:tab w:val="num" w:pos="6120"/>
         </w:tabs>
-        <w:ind w:left="6022" w:hanging="360"/>
+        <w:ind w:left="6120" w:hanging="360"/>
       </w:pPr>
       <w:rPr>
         <w:rFonts w:ascii="Wingdings" w:hAnsi="Wingdings" w:hint="default"/>
@@ -14927,9 +15257,9 @@
       <w:lvlJc w:val="left"/>
       <w:pPr>
         <w:tabs>
-          <w:tab w:val="num" w:pos="6742"/>
+          <w:tab w:val="num" w:pos="6840"/>
         </w:tabs>
-        <w:ind w:left="6742" w:hanging="360"/>
+        <w:ind w:left="6840" w:hanging="360"/>
       </w:pPr>
       <w:rPr>
         <w:rFonts w:ascii="Wingdings" w:hAnsi="Wingdings" w:hint="default"/>

</xml_diff>